<commit_message>
Embed recap excerpt in slide 11; scripted speaker-script build
Slide 11 now plays a 42 s excerpt (chapter 5 + its clip) inside the
slide show, so one PowerPoint "Record Slide Show" captures the whole
explanation video. Speaker_Script.docx is generated by
docs/make_speaker_script.py and includes recording/export steps.

Co-Authored-By: Claude Opus 5.5 <noreply@anthropic.com>
</commit_message>
<xml_diff>
--- a/docs/Speaker_Script.docx
+++ b/docs/Speaker_Script.docx
@@ -17,7 +17,7 @@
     </w:p>
     <w:p>
       <w:r>
-        <w:t>Slides: 15  |  Spoken time: about 15 min 45 s, plus about 1 minute of recap playback on slide 11 (total about 17 minutes, inside the required 8-20 minutes). The same text is in the speaker notes of each slide.</w:t>
+        <w:t>Slides: 15  |  Spoken time about 15 min 45 s, plus the 42 s recap excerpt embedded in slide 11 (total about 16 min 27 s, inside the required 8-20 minutes). The same text is in each slide's speaker notes.</w:t>
       </w:r>
     </w:p>
     <w:p>
@@ -25,7 +25,7 @@
         <w:pStyle w:val="Heading2"/>
       </w:pPr>
       <w:r>
-        <w:t>Recording tips</w:t>
+        <w:t>Recording steps</w:t>
       </w:r>
     </w:p>
     <w:p>
@@ -33,7 +33,7 @@
         <w:pStyle w:val="ListBullet"/>
       </w:pPr>
       <w:r>
-        <w:t>Record with PowerPoint (Slide Show &gt; Record) or OBS; speak at a relaxed pace (about 130 words per minute).</w:t>
+        <w:t>Open docs/Movie_Recap_Presentation.pptx in PowerPoint and choose Slide Show &gt; Record &gt; From Beginning.</w:t>
       </w:r>
     </w:p>
     <w:p>
@@ -41,7 +41,7 @@
         <w:pStyle w:val="ListBullet"/>
       </w:pPr>
       <w:r>
-        <w:t>On slide 11, switch to outputs/detour_1945/movie_recap.mp4 and play about one minute: a chapter card followed by its clip.</w:t>
+        <w:t>Turn the camera on if you want your face in the corner; the microphone records your narration.</w:t>
       </w:r>
     </w:p>
     <w:p>
@@ -49,7 +49,31 @@
         <w:pStyle w:val="ListBullet"/>
       </w:pPr>
       <w:r>
-        <w:t>Optionally show a 30-second terminal demo: python run_pipeline.py (cached stages finish in a few minutes).</w:t>
+        <w:t>On slide 11, click the video and let the 42 s excerpt play: PowerPoint records it with its sound.</w:t>
+      </w:r>
+    </w:p>
+    <w:p>
+      <w:pPr>
+        <w:pStyle w:val="ListBullet"/>
+      </w:pPr>
+      <w:r>
+        <w:t>Speak at a relaxed pace (about 130 words per minute); pause briefly when moving to the next slide.</w:t>
+      </w:r>
+    </w:p>
+    <w:p>
+      <w:pPr>
+        <w:pStyle w:val="ListBullet"/>
+      </w:pPr>
+      <w:r>
+        <w:t>When finished: File &gt; Export &gt; Create a Video (Full HD, use recorded timings and narrations) to get an MP4.</w:t>
+      </w:r>
+    </w:p>
+    <w:p>
+      <w:pPr>
+        <w:pStyle w:val="ListBullet"/>
+      </w:pPr>
+      <w:r>
+        <w:t>Check the exported MP4 is between 8 and 20 minutes before uploading.</w:t>
       </w:r>
     </w:p>
     <w:p>
@@ -286,12 +310,12 @@
           <w:i/>
           <w:color w:val="8A8984"/>
         </w:rPr>
-        <w:t>10:10 - 11:10  (~60 s, 128 words)</w:t>
+        <w:t>10:10 - 11:10  (~60 s, 153 words)</w:t>
       </w:r>
     </w:p>
     <w:p>
       <w:r>
-        <w:t>And this is the output. The recap is eight minutes fifty-one seconds long, so it is under the ten-minute limit, and it compresses the film by a factor of about seven and a half. About six and a half minutes are original footage. Before each clip, a chapter card reads out the story sentence, using offline text-to-speech that is loudness-matched to the old soundtrack. During each clip you can see the original timecode, the peak number, a bar along the bottom showing where in the film the clip comes from, and a white flash at the exact peak moment. So the link between the summary, the peak point, the time index and the segment is visible on screen. I will now play a short part of the recap.</w:t>
+        <w:t>And this is the output. The recap is eight minutes fifty-one seconds long, so it is under the ten-minute limit, and it compresses the film by a factor of about seven and a half. About six and a half minutes are original footage. Before each clip, a chapter card reads out the story sentence, using offline text-to-speech that is loudness-matched to the old soundtrack. During each clip you can see the original timecode, the peak number, a bar along the bottom showing where in the film the clip comes from, and a white flash at the exact peak moment. So the link between the summary, the peak point, the time index and the segment is visible on screen. Let me play the excerpt on this slide: it is chapter five, the card about Haskell's body, followed by its clip from minute twenty-four. [Click the video and let it play for about forty seconds.]</w:t>
       </w:r>
     </w:p>
     <w:p>
@@ -308,7 +332,7 @@
           <w:i/>
           <w:color w:val="8A8984"/>
         </w:rPr>
-        <w:t>12:10 - 13:25  (~75 s, 122 words)</w:t>
+        <w:t>11:52 - 13:07  (~75 s, 122 words)</w:t>
       </w:r>
     </w:p>
     <w:p>
@@ -330,7 +354,7 @@
           <w:i/>
           <w:color w:val="8A8984"/>
         </w:rPr>
-        <w:t>13:25 - 14:35  (~70 s, 132 words)</w:t>
+        <w:t>13:07 - 14:17  (~70 s, 132 words)</w:t>
       </w:r>
     </w:p>
     <w:p>
@@ -352,7 +376,7 @@
           <w:i/>
           <w:color w:val="8A8984"/>
         </w:rPr>
-        <w:t>14:35 - 15:35  (~60 s, 112 words)</w:t>
+        <w:t>14:17 - 15:17  (~60 s, 112 words)</w:t>
       </w:r>
     </w:p>
     <w:p>
@@ -374,7 +398,7 @@
           <w:i/>
           <w:color w:val="8A8984"/>
         </w:rPr>
-        <w:t>15:35 - 16:45  (~70 s, 135 words)</w:t>
+        <w:t>15:17 - 16:27  (~70 s, 135 words)</w:t>
       </w:r>
     </w:p>
     <w:p>

</xml_diff>